<commit_message>
Update file báo cáo
Update payment theo 3nf
</commit_message>
<xml_diff>
--- a/Freelance_Marketplace_Ecosystem .docx
+++ b/Freelance_Marketplace_Ecosystem .docx
@@ -2484,8 +2484,52 @@
       </w:r>
     </w:p>
     <w:p>
+      <w:pPr>
+        <w:rPr>
+          <w:lang w:val="vi-VN"/>
+        </w:rPr>
+      </w:pPr>
       <w:r>
-        <w:t>payments(payment_id PK, milestone_id FK, payer_id FK, payee_id FK, amount, payment_status, payment_method, paid_milestone_id UQ)</w:t>
+        <w:rPr>
+          <w:lang w:val="vi-VN"/>
+        </w:rPr>
+        <w:t>payments(payment_id PK,</w:t>
+      </w:r>
+      <w:r>
+        <w:t xml:space="preserve"> </w:t>
+      </w:r>
+      <w:r>
+        <w:rPr>
+          <w:lang w:val="vi-VN"/>
+        </w:rPr>
+        <w:t>milestone_id FK,</w:t>
+      </w:r>
+      <w:r>
+        <w:t xml:space="preserve"> </w:t>
+      </w:r>
+      <w:r>
+        <w:rPr>
+          <w:lang w:val="vi-VN"/>
+        </w:rPr>
+        <w:t>payment_status,</w:t>
+      </w:r>
+      <w:r>
+        <w:t xml:space="preserve"> </w:t>
+      </w:r>
+      <w:r>
+        <w:rPr>
+          <w:lang w:val="vi-VN"/>
+        </w:rPr>
+        <w:t>payment_method,</w:t>
+      </w:r>
+      <w:r>
+        <w:t xml:space="preserve"> </w:t>
+      </w:r>
+      <w:r>
+        <w:rPr>
+          <w:lang w:val="vi-VN"/>
+        </w:rPr>
+        <w:t>paid_milestone_id UQ [generated])</w:t>
       </w:r>
     </w:p>
     <w:p>
@@ -3980,7 +4024,7 @@
               <w:rPr>
                 <w:sz w:val="18"/>
               </w:rPr>
-              <w:t>2NF only</w:t>
+              <w:t>BCNF</w:t>
             </w:r>
           </w:p>
         </w:tc>
@@ -17202,543 +17246,6 @@
                 <w:sz w:val="18"/>
               </w:rPr>
               <w:t>References milestones; many attempts, at most one PAID.</w:t>
-            </w:r>
-          </w:p>
-        </w:tc>
-      </w:tr>
-      <w:tr>
-        <w:trPr>
-          <w:cantSplit/>
-        </w:trPr>
-        <w:tc>
-          <w:tcPr>
-            <w:tcW w:w="1800" w:type="dxa"/>
-            <w:tcBorders>
-              <w:top w:val="single" w:sz="4" w:space="0" w:color="D9D9D9"/>
-              <w:left w:val="single" w:sz="4" w:space="0" w:color="D9D9D9"/>
-              <w:bottom w:val="single" w:sz="4" w:space="0" w:color="D9D9D9"/>
-              <w:right w:val="single" w:sz="4" w:space="0" w:color="D9D9D9"/>
-            </w:tcBorders>
-            <w:shd w:val="clear" w:color="auto" w:fill="FFFFFF"/>
-            <w:tcMar>
-              <w:top w:w="80" w:type="dxa"/>
-              <w:left w:w="80" w:type="dxa"/>
-              <w:bottom w:w="80" w:type="dxa"/>
-              <w:right w:w="80" w:type="dxa"/>
-            </w:tcMar>
-          </w:tcPr>
-          <w:p>
-            <w:pPr>
-              <w:spacing w:before="40" w:after="40" w:line="252" w:lineRule="auto"/>
-            </w:pPr>
-            <w:r>
-              <w:rPr>
-                <w:sz w:val="18"/>
-              </w:rPr>
-              <w:t>payer_id</w:t>
-            </w:r>
-          </w:p>
-        </w:tc>
-        <w:tc>
-          <w:tcPr>
-            <w:tcW w:w="1440" w:type="dxa"/>
-            <w:tcBorders>
-              <w:top w:val="single" w:sz="4" w:space="0" w:color="D9D9D9"/>
-              <w:left w:val="single" w:sz="4" w:space="0" w:color="D9D9D9"/>
-              <w:bottom w:val="single" w:sz="4" w:space="0" w:color="D9D9D9"/>
-              <w:right w:val="single" w:sz="4" w:space="0" w:color="D9D9D9"/>
-            </w:tcBorders>
-            <w:shd w:val="clear" w:color="auto" w:fill="FFFFFF"/>
-            <w:tcMar>
-              <w:top w:w="80" w:type="dxa"/>
-              <w:left w:w="80" w:type="dxa"/>
-              <w:bottom w:w="80" w:type="dxa"/>
-              <w:right w:w="80" w:type="dxa"/>
-            </w:tcMar>
-          </w:tcPr>
-          <w:p>
-            <w:pPr>
-              <w:spacing w:before="40" w:after="40" w:line="252" w:lineRule="auto"/>
-            </w:pPr>
-            <w:r>
-              <w:rPr>
-                <w:sz w:val="18"/>
-              </w:rPr>
-              <w:t>INT</w:t>
-            </w:r>
-          </w:p>
-        </w:tc>
-        <w:tc>
-          <w:tcPr>
-            <w:tcW w:w="720" w:type="dxa"/>
-            <w:tcBorders>
-              <w:top w:val="single" w:sz="4" w:space="0" w:color="D9D9D9"/>
-              <w:left w:val="single" w:sz="4" w:space="0" w:color="D9D9D9"/>
-              <w:bottom w:val="single" w:sz="4" w:space="0" w:color="D9D9D9"/>
-              <w:right w:val="single" w:sz="4" w:space="0" w:color="D9D9D9"/>
-            </w:tcBorders>
-            <w:shd w:val="clear" w:color="auto" w:fill="FFFFFF"/>
-            <w:tcMar>
-              <w:top w:w="80" w:type="dxa"/>
-              <w:left w:w="80" w:type="dxa"/>
-              <w:bottom w:w="80" w:type="dxa"/>
-              <w:right w:w="80" w:type="dxa"/>
-            </w:tcMar>
-          </w:tcPr>
-          <w:p>
-            <w:pPr>
-              <w:spacing w:before="40" w:after="40" w:line="252" w:lineRule="auto"/>
-            </w:pPr>
-            <w:r>
-              <w:rPr>
-                <w:sz w:val="18"/>
-              </w:rPr>
-              <w:t>FK</w:t>
-            </w:r>
-          </w:p>
-        </w:tc>
-        <w:tc>
-          <w:tcPr>
-            <w:tcW w:w="576" w:type="dxa"/>
-            <w:tcBorders>
-              <w:top w:val="single" w:sz="4" w:space="0" w:color="D9D9D9"/>
-              <w:left w:val="single" w:sz="4" w:space="0" w:color="D9D9D9"/>
-              <w:bottom w:val="single" w:sz="4" w:space="0" w:color="D9D9D9"/>
-              <w:right w:val="single" w:sz="4" w:space="0" w:color="D9D9D9"/>
-            </w:tcBorders>
-            <w:shd w:val="clear" w:color="auto" w:fill="FFFFFF"/>
-            <w:tcMar>
-              <w:top w:w="80" w:type="dxa"/>
-              <w:left w:w="80" w:type="dxa"/>
-              <w:bottom w:w="80" w:type="dxa"/>
-              <w:right w:w="80" w:type="dxa"/>
-            </w:tcMar>
-          </w:tcPr>
-          <w:p>
-            <w:pPr>
-              <w:spacing w:before="40" w:after="40" w:line="252" w:lineRule="auto"/>
-            </w:pPr>
-            <w:r>
-              <w:rPr>
-                <w:sz w:val="18"/>
-              </w:rPr>
-              <w:t>No</w:t>
-            </w:r>
-          </w:p>
-        </w:tc>
-        <w:tc>
-          <w:tcPr>
-            <w:tcW w:w="1584" w:type="dxa"/>
-            <w:tcBorders>
-              <w:top w:val="single" w:sz="4" w:space="0" w:color="D9D9D9"/>
-              <w:left w:val="single" w:sz="4" w:space="0" w:color="D9D9D9"/>
-              <w:bottom w:val="single" w:sz="4" w:space="0" w:color="D9D9D9"/>
-              <w:right w:val="single" w:sz="4" w:space="0" w:color="D9D9D9"/>
-            </w:tcBorders>
-            <w:shd w:val="clear" w:color="auto" w:fill="FFFFFF"/>
-            <w:tcMar>
-              <w:top w:w="80" w:type="dxa"/>
-              <w:left w:w="80" w:type="dxa"/>
-              <w:bottom w:w="80" w:type="dxa"/>
-              <w:right w:w="80" w:type="dxa"/>
-            </w:tcMar>
-          </w:tcPr>
-          <w:p>
-            <w:pPr>
-              <w:spacing w:before="40" w:after="40" w:line="252" w:lineRule="auto"/>
-            </w:pPr>
-            <w:r>
-              <w:rPr>
-                <w:sz w:val="18"/>
-              </w:rPr>
-              <w:t>None</w:t>
-            </w:r>
-          </w:p>
-        </w:tc>
-        <w:tc>
-          <w:tcPr>
-            <w:tcW w:w="3672" w:type="dxa"/>
-            <w:tcBorders>
-              <w:top w:val="single" w:sz="4" w:space="0" w:color="D9D9D9"/>
-              <w:left w:val="single" w:sz="4" w:space="0" w:color="D9D9D9"/>
-              <w:bottom w:val="single" w:sz="4" w:space="0" w:color="D9D9D9"/>
-              <w:right w:val="single" w:sz="4" w:space="0" w:color="D9D9D9"/>
-            </w:tcBorders>
-            <w:shd w:val="clear" w:color="auto" w:fill="FFFFFF"/>
-            <w:tcMar>
-              <w:top w:w="80" w:type="dxa"/>
-              <w:left w:w="80" w:type="dxa"/>
-              <w:bottom w:w="80" w:type="dxa"/>
-              <w:right w:w="80" w:type="dxa"/>
-            </w:tcMar>
-          </w:tcPr>
-          <w:p>
-            <w:pPr>
-              <w:spacing w:before="40" w:after="40" w:line="252" w:lineRule="auto"/>
-            </w:pPr>
-            <w:r>
-              <w:rPr>
-                <w:sz w:val="18"/>
-              </w:rPr>
-              <w:t>FK users; must equal contract.client_id (BR-16).</w:t>
-            </w:r>
-          </w:p>
-        </w:tc>
-      </w:tr>
-      <w:tr>
-        <w:trPr>
-          <w:cantSplit/>
-        </w:trPr>
-        <w:tc>
-          <w:tcPr>
-            <w:tcW w:w="1800" w:type="dxa"/>
-            <w:tcBorders>
-              <w:top w:val="single" w:sz="4" w:space="0" w:color="D9D9D9"/>
-              <w:left w:val="single" w:sz="4" w:space="0" w:color="D9D9D9"/>
-              <w:bottom w:val="single" w:sz="4" w:space="0" w:color="D9D9D9"/>
-              <w:right w:val="single" w:sz="4" w:space="0" w:color="D9D9D9"/>
-            </w:tcBorders>
-            <w:shd w:val="clear" w:color="auto" w:fill="F7F9FB"/>
-            <w:tcMar>
-              <w:top w:w="80" w:type="dxa"/>
-              <w:left w:w="80" w:type="dxa"/>
-              <w:bottom w:w="80" w:type="dxa"/>
-              <w:right w:w="80" w:type="dxa"/>
-            </w:tcMar>
-          </w:tcPr>
-          <w:p>
-            <w:pPr>
-              <w:spacing w:before="40" w:after="40" w:line="252" w:lineRule="auto"/>
-            </w:pPr>
-            <w:r>
-              <w:rPr>
-                <w:sz w:val="18"/>
-              </w:rPr>
-              <w:t>payee_id</w:t>
-            </w:r>
-          </w:p>
-        </w:tc>
-        <w:tc>
-          <w:tcPr>
-            <w:tcW w:w="1440" w:type="dxa"/>
-            <w:tcBorders>
-              <w:top w:val="single" w:sz="4" w:space="0" w:color="D9D9D9"/>
-              <w:left w:val="single" w:sz="4" w:space="0" w:color="D9D9D9"/>
-              <w:bottom w:val="single" w:sz="4" w:space="0" w:color="D9D9D9"/>
-              <w:right w:val="single" w:sz="4" w:space="0" w:color="D9D9D9"/>
-            </w:tcBorders>
-            <w:shd w:val="clear" w:color="auto" w:fill="F7F9FB"/>
-            <w:tcMar>
-              <w:top w:w="80" w:type="dxa"/>
-              <w:left w:w="80" w:type="dxa"/>
-              <w:bottom w:w="80" w:type="dxa"/>
-              <w:right w:w="80" w:type="dxa"/>
-            </w:tcMar>
-          </w:tcPr>
-          <w:p>
-            <w:pPr>
-              <w:spacing w:before="40" w:after="40" w:line="252" w:lineRule="auto"/>
-            </w:pPr>
-            <w:r>
-              <w:rPr>
-                <w:sz w:val="18"/>
-              </w:rPr>
-              <w:t>INT</w:t>
-            </w:r>
-          </w:p>
-        </w:tc>
-        <w:tc>
-          <w:tcPr>
-            <w:tcW w:w="720" w:type="dxa"/>
-            <w:tcBorders>
-              <w:top w:val="single" w:sz="4" w:space="0" w:color="D9D9D9"/>
-              <w:left w:val="single" w:sz="4" w:space="0" w:color="D9D9D9"/>
-              <w:bottom w:val="single" w:sz="4" w:space="0" w:color="D9D9D9"/>
-              <w:right w:val="single" w:sz="4" w:space="0" w:color="D9D9D9"/>
-            </w:tcBorders>
-            <w:shd w:val="clear" w:color="auto" w:fill="F7F9FB"/>
-            <w:tcMar>
-              <w:top w:w="80" w:type="dxa"/>
-              <w:left w:w="80" w:type="dxa"/>
-              <w:bottom w:w="80" w:type="dxa"/>
-              <w:right w:w="80" w:type="dxa"/>
-            </w:tcMar>
-          </w:tcPr>
-          <w:p>
-            <w:pPr>
-              <w:spacing w:before="40" w:after="40" w:line="252" w:lineRule="auto"/>
-            </w:pPr>
-            <w:r>
-              <w:rPr>
-                <w:sz w:val="18"/>
-              </w:rPr>
-              <w:t>FK</w:t>
-            </w:r>
-          </w:p>
-        </w:tc>
-        <w:tc>
-          <w:tcPr>
-            <w:tcW w:w="576" w:type="dxa"/>
-            <w:tcBorders>
-              <w:top w:val="single" w:sz="4" w:space="0" w:color="D9D9D9"/>
-              <w:left w:val="single" w:sz="4" w:space="0" w:color="D9D9D9"/>
-              <w:bottom w:val="single" w:sz="4" w:space="0" w:color="D9D9D9"/>
-              <w:right w:val="single" w:sz="4" w:space="0" w:color="D9D9D9"/>
-            </w:tcBorders>
-            <w:shd w:val="clear" w:color="auto" w:fill="F7F9FB"/>
-            <w:tcMar>
-              <w:top w:w="80" w:type="dxa"/>
-              <w:left w:w="80" w:type="dxa"/>
-              <w:bottom w:w="80" w:type="dxa"/>
-              <w:right w:w="80" w:type="dxa"/>
-            </w:tcMar>
-          </w:tcPr>
-          <w:p>
-            <w:pPr>
-              <w:spacing w:before="40" w:after="40" w:line="252" w:lineRule="auto"/>
-            </w:pPr>
-            <w:r>
-              <w:rPr>
-                <w:sz w:val="18"/>
-              </w:rPr>
-              <w:t>No</w:t>
-            </w:r>
-          </w:p>
-        </w:tc>
-        <w:tc>
-          <w:tcPr>
-            <w:tcW w:w="1584" w:type="dxa"/>
-            <w:tcBorders>
-              <w:top w:val="single" w:sz="4" w:space="0" w:color="D9D9D9"/>
-              <w:left w:val="single" w:sz="4" w:space="0" w:color="D9D9D9"/>
-              <w:bottom w:val="single" w:sz="4" w:space="0" w:color="D9D9D9"/>
-              <w:right w:val="single" w:sz="4" w:space="0" w:color="D9D9D9"/>
-            </w:tcBorders>
-            <w:shd w:val="clear" w:color="auto" w:fill="F7F9FB"/>
-            <w:tcMar>
-              <w:top w:w="80" w:type="dxa"/>
-              <w:left w:w="80" w:type="dxa"/>
-              <w:bottom w:w="80" w:type="dxa"/>
-              <w:right w:w="80" w:type="dxa"/>
-            </w:tcMar>
-          </w:tcPr>
-          <w:p>
-            <w:pPr>
-              <w:spacing w:before="40" w:after="40" w:line="252" w:lineRule="auto"/>
-            </w:pPr>
-            <w:r>
-              <w:rPr>
-                <w:sz w:val="18"/>
-              </w:rPr>
-              <w:t>None</w:t>
-            </w:r>
-          </w:p>
-        </w:tc>
-        <w:tc>
-          <w:tcPr>
-            <w:tcW w:w="3672" w:type="dxa"/>
-            <w:tcBorders>
-              <w:top w:val="single" w:sz="4" w:space="0" w:color="D9D9D9"/>
-              <w:left w:val="single" w:sz="4" w:space="0" w:color="D9D9D9"/>
-              <w:bottom w:val="single" w:sz="4" w:space="0" w:color="D9D9D9"/>
-              <w:right w:val="single" w:sz="4" w:space="0" w:color="D9D9D9"/>
-            </w:tcBorders>
-            <w:shd w:val="clear" w:color="auto" w:fill="F7F9FB"/>
-            <w:tcMar>
-              <w:top w:w="80" w:type="dxa"/>
-              <w:left w:w="80" w:type="dxa"/>
-              <w:bottom w:w="80" w:type="dxa"/>
-              <w:right w:w="80" w:type="dxa"/>
-            </w:tcMar>
-          </w:tcPr>
-          <w:p>
-            <w:pPr>
-              <w:spacing w:before="40" w:after="40" w:line="252" w:lineRule="auto"/>
-            </w:pPr>
-            <w:r>
-              <w:rPr>
-                <w:sz w:val="18"/>
-              </w:rPr>
-              <w:t>FK users; must equal contract.freelancer_id (BR-16).</w:t>
-            </w:r>
-          </w:p>
-        </w:tc>
-      </w:tr>
-      <w:tr>
-        <w:trPr>
-          <w:cantSplit/>
-        </w:trPr>
-        <w:tc>
-          <w:tcPr>
-            <w:tcW w:w="1800" w:type="dxa"/>
-            <w:tcBorders>
-              <w:top w:val="single" w:sz="4" w:space="0" w:color="D9D9D9"/>
-              <w:left w:val="single" w:sz="4" w:space="0" w:color="D9D9D9"/>
-              <w:bottom w:val="single" w:sz="4" w:space="0" w:color="D9D9D9"/>
-              <w:right w:val="single" w:sz="4" w:space="0" w:color="D9D9D9"/>
-            </w:tcBorders>
-            <w:shd w:val="clear" w:color="auto" w:fill="FFFFFF"/>
-            <w:tcMar>
-              <w:top w:w="80" w:type="dxa"/>
-              <w:left w:w="80" w:type="dxa"/>
-              <w:bottom w:w="80" w:type="dxa"/>
-              <w:right w:w="80" w:type="dxa"/>
-            </w:tcMar>
-          </w:tcPr>
-          <w:p>
-            <w:pPr>
-              <w:spacing w:before="40" w:after="40" w:line="252" w:lineRule="auto"/>
-            </w:pPr>
-            <w:r>
-              <w:rPr>
-                <w:sz w:val="18"/>
-              </w:rPr>
-              <w:t>amount</w:t>
-            </w:r>
-          </w:p>
-        </w:tc>
-        <w:tc>
-          <w:tcPr>
-            <w:tcW w:w="1440" w:type="dxa"/>
-            <w:tcBorders>
-              <w:top w:val="single" w:sz="4" w:space="0" w:color="D9D9D9"/>
-              <w:left w:val="single" w:sz="4" w:space="0" w:color="D9D9D9"/>
-              <w:bottom w:val="single" w:sz="4" w:space="0" w:color="D9D9D9"/>
-              <w:right w:val="single" w:sz="4" w:space="0" w:color="D9D9D9"/>
-            </w:tcBorders>
-            <w:shd w:val="clear" w:color="auto" w:fill="FFFFFF"/>
-            <w:tcMar>
-              <w:top w:w="80" w:type="dxa"/>
-              <w:left w:w="80" w:type="dxa"/>
-              <w:bottom w:w="80" w:type="dxa"/>
-              <w:right w:w="80" w:type="dxa"/>
-            </w:tcMar>
-          </w:tcPr>
-          <w:p>
-            <w:pPr>
-              <w:spacing w:before="40" w:after="40" w:line="252" w:lineRule="auto"/>
-            </w:pPr>
-            <w:r>
-              <w:rPr>
-                <w:sz w:val="18"/>
-              </w:rPr>
-              <w:t>DECIMAL(15,2)</w:t>
-            </w:r>
-          </w:p>
-        </w:tc>
-        <w:tc>
-          <w:tcPr>
-            <w:tcW w:w="720" w:type="dxa"/>
-            <w:tcBorders>
-              <w:top w:val="single" w:sz="4" w:space="0" w:color="D9D9D9"/>
-              <w:left w:val="single" w:sz="4" w:space="0" w:color="D9D9D9"/>
-              <w:bottom w:val="single" w:sz="4" w:space="0" w:color="D9D9D9"/>
-              <w:right w:val="single" w:sz="4" w:space="0" w:color="D9D9D9"/>
-            </w:tcBorders>
-            <w:shd w:val="clear" w:color="auto" w:fill="FFFFFF"/>
-            <w:tcMar>
-              <w:top w:w="80" w:type="dxa"/>
-              <w:left w:w="80" w:type="dxa"/>
-              <w:bottom w:w="80" w:type="dxa"/>
-              <w:right w:w="80" w:type="dxa"/>
-            </w:tcMar>
-          </w:tcPr>
-          <w:p>
-            <w:pPr>
-              <w:spacing w:before="40" w:after="40" w:line="252" w:lineRule="auto"/>
-            </w:pPr>
-            <w:r>
-              <w:rPr>
-                <w:sz w:val="18"/>
-              </w:rPr>
-              <w:t>None</w:t>
-            </w:r>
-          </w:p>
-        </w:tc>
-        <w:tc>
-          <w:tcPr>
-            <w:tcW w:w="576" w:type="dxa"/>
-            <w:tcBorders>
-              <w:top w:val="single" w:sz="4" w:space="0" w:color="D9D9D9"/>
-              <w:left w:val="single" w:sz="4" w:space="0" w:color="D9D9D9"/>
-              <w:bottom w:val="single" w:sz="4" w:space="0" w:color="D9D9D9"/>
-              <w:right w:val="single" w:sz="4" w:space="0" w:color="D9D9D9"/>
-            </w:tcBorders>
-            <w:shd w:val="clear" w:color="auto" w:fill="FFFFFF"/>
-            <w:tcMar>
-              <w:top w:w="80" w:type="dxa"/>
-              <w:left w:w="80" w:type="dxa"/>
-              <w:bottom w:w="80" w:type="dxa"/>
-              <w:right w:w="80" w:type="dxa"/>
-            </w:tcMar>
-          </w:tcPr>
-          <w:p>
-            <w:pPr>
-              <w:spacing w:before="40" w:after="40" w:line="252" w:lineRule="auto"/>
-            </w:pPr>
-            <w:r>
-              <w:rPr>
-                <w:sz w:val="18"/>
-              </w:rPr>
-              <w:t>No</w:t>
-            </w:r>
-          </w:p>
-        </w:tc>
-        <w:tc>
-          <w:tcPr>
-            <w:tcW w:w="1584" w:type="dxa"/>
-            <w:tcBorders>
-              <w:top w:val="single" w:sz="4" w:space="0" w:color="D9D9D9"/>
-              <w:left w:val="single" w:sz="4" w:space="0" w:color="D9D9D9"/>
-              <w:bottom w:val="single" w:sz="4" w:space="0" w:color="D9D9D9"/>
-              <w:right w:val="single" w:sz="4" w:space="0" w:color="D9D9D9"/>
-            </w:tcBorders>
-            <w:shd w:val="clear" w:color="auto" w:fill="FFFFFF"/>
-            <w:tcMar>
-              <w:top w:w="80" w:type="dxa"/>
-              <w:left w:w="80" w:type="dxa"/>
-              <w:bottom w:w="80" w:type="dxa"/>
-              <w:right w:w="80" w:type="dxa"/>
-            </w:tcMar>
-          </w:tcPr>
-          <w:p>
-            <w:pPr>
-              <w:spacing w:before="40" w:after="40" w:line="252" w:lineRule="auto"/>
-            </w:pPr>
-            <w:r>
-              <w:rPr>
-                <w:sz w:val="18"/>
-              </w:rPr>
-              <w:t>None</w:t>
-            </w:r>
-          </w:p>
-        </w:tc>
-        <w:tc>
-          <w:tcPr>
-            <w:tcW w:w="3672" w:type="dxa"/>
-            <w:tcBorders>
-              <w:top w:val="single" w:sz="4" w:space="0" w:color="D9D9D9"/>
-              <w:left w:val="single" w:sz="4" w:space="0" w:color="D9D9D9"/>
-              <w:bottom w:val="single" w:sz="4" w:space="0" w:color="D9D9D9"/>
-              <w:right w:val="single" w:sz="4" w:space="0" w:color="D9D9D9"/>
-            </w:tcBorders>
-            <w:shd w:val="clear" w:color="auto" w:fill="FFFFFF"/>
-            <w:tcMar>
-              <w:top w:w="80" w:type="dxa"/>
-              <w:left w:w="80" w:type="dxa"/>
-              <w:bottom w:w="80" w:type="dxa"/>
-              <w:right w:w="80" w:type="dxa"/>
-            </w:tcMar>
-          </w:tcPr>
-          <w:p>
-            <w:pPr>
-              <w:spacing w:before="40" w:after="40" w:line="252" w:lineRule="auto"/>
-            </w:pPr>
-            <w:r>
-              <w:rPr>
-                <w:sz w:val="18"/>
-              </w:rPr>
-              <w:t>DECIMAL positive; exactly milestone.amount; immutable.</w:t>
             </w:r>
           </w:p>
         </w:tc>
@@ -36868,7 +36375,6 @@
   <w:style w:type="character" w:default="1" w:styleId="DefaultParagraphFont">
     <w:name w:val="Default Paragraph Font"/>
     <w:uiPriority w:val="1"/>
-    <w:semiHidden/>
     <w:unhideWhenUsed/>
   </w:style>
   <w:style w:type="table" w:default="1" w:styleId="TableNormal">

</xml_diff>